<commit_message>
docs: update master plan, syllabi, guides and rebuild log
</commit_message>
<xml_diff>
--- a/IUEA_Teaching_Plan/IUEA_ML_Lecturer_Teaching_Guide_W1-W15.docx
+++ b/IUEA_Teaching_Plan/IUEA_ML_Lecturer_Teaching_Guide_W1-W15.docx
@@ -2130,7 +2130,7 @@
           <w:i w:val="0"/>
           <w:sz w:val="21"/>
         </w:rPr>
-        <w:t>if asked about VS Code — it is the professional local editor and the Student Setup Guide covers it. Anyone who wants a local setup is welcome. Note that the Week 7 and Week 14 tests run offline on lab machines, so everyone meets a local environment at least once.</w:t>
+        <w:t>if asked about VS Code — it is the professional local editor and the Student Setup Guide covers it. Anyone who wants a local setup is welcome. Note that the Week 7 and Week 14 tests run in Colab, so students need no local setup for them.</w:t>
       </w:r>
     </w:p>
     <w:p>
@@ -6010,21 +6010,21 @@
         <w:pStyle w:val="Heading3"/>
       </w:pPr>
       <w:r>
-        <w:t>Slide 1 · Individual · offline · two hours plus twenty-five minutes</w:t>
-      </w:r>
-    </w:p>
-    <w:p>
-      <w:pPr>
-        <w:spacing w:after="160" w:before="0" w:line="283" w:lineRule="auto"/>
-      </w:pPr>
-      <w:r>
-        <w:rPr>
-          <w:rFonts w:ascii="Calibri" w:hAnsi="Calibri"/>
-          <w:b w:val="0"/>
-          <w:i w:val="0"/>
-          <w:sz w:val="21"/>
-        </w:rPr>
-        <w:t>read the rules aloud from slide 4 rather than paraphrasing. Have the three dataset variants distributed in a checkerboard pattern before anyone sits down, and confirm the machines have no network before you start the clock.</w:t>
+        <w:t>Slide 1 · Individual · Colab practical · three hours</w:t>
+      </w:r>
+    </w:p>
+    <w:p>
+      <w:pPr>
+        <w:spacing w:after="160" w:before="0" w:line="283" w:lineRule="auto"/>
+      </w:pPr>
+      <w:r>
+        <w:rPr>
+          <w:rFonts w:ascii="Calibri" w:hAnsi="Calibri"/>
+          <w:b w:val="0"/>
+          <w:i w:val="0"/>
+          <w:sz w:val="21"/>
+        </w:rPr>
+        <w:t>read the rules aloud from slide 4 rather than paraphrasing. Students open their private notebook from the entry link and need a working connection and their Google account. Distribute the three dataset variants in a checkerboard pattern before anyone sits down.</w:t>
       </w:r>
     </w:p>
     <w:p>
@@ -9188,7 +9188,7 @@
           <w:i w:val="0"/>
           <w:sz w:val="21"/>
         </w:rPr>
-        <w:t>issue this deck in Week 13. On the day, read the rules slide aloud from the screen and confirm the offline state of every machine before distributing task sheets. Author three parallel dataset variants of matched difficulty with a model answer and mark scheme each, and seat them in a checkerboard pattern.</w:t>
+        <w:t>issue this deck in Week 13. On the day, read the rules slide aloud from the screen and confirm that every student can open their entry link and Colab before the test window opens. The three dataset variants are assigned by the entry page.</w:t>
       </w:r>
     </w:p>
     <w:p>
@@ -9232,7 +9232,7 @@
           <w:i w:val="0"/>
           <w:sz w:val="21"/>
         </w:rPr>
-        <w:t>read this slide aloud from the screen at the start. Then confirm every machine's offline state before you distribute the task sheets.</w:t>
+        <w:t>read this slide aloud from the screen at the start. Then confirm that every student has signed in with the same Google account they registered, and that the entry page shows their notebook and CSV.</w:t>
       </w:r>
     </w:p>
     <w:p>

</xml_diff>